<commit_message>
Recheck: spec proven 100% (8664/8664) all 53 indicators; resolved references for 195
Applied recheck/reassess: verified standardise(raw,spec) vs the workbook across ALL 53 used indicators
x 170 districts, not a 5-indicator sample. Result 8664/8664 = 100.00% with Excel half-up rounding.
Two build requirements found (not spec errors): Excel rounding (JS Math.round matches; Python round
does not), and freeze the RESOLVED reference (proc-22 data range for data-range indicators e.g. drought
[5,19], not the leftover custom Max/Min cells - would have broken 36 indicators). Spec CSV rewritten with
resolved_min/resolved_max = the fixed reference each indicator gets at 195. Plan updated. 2 edge cases
(degenerate custom[0,0], all-No-data) caught by the diagnostics. Engine untouched.

Co-Authored-By: Claude Opus 4.8 (1M context) <noreply@anthropic.com>
</commit_message>
<xml_diff>
--- a/docs/LOCAL_DATA_INTEGRATION_PLAN.docx
+++ b/docs/LOCAL_DATA_INTEGRATION_PLAN.docx
@@ -1067,55 +1067,53 @@
         <w:pStyle w:val="BodyText"/>
       </w:pPr>
       <w:r>
-        <w:t xml:space="preserve">The spec is a</w:t>
-      </w:r>
-      <w:r>
-        <w:t xml:space="preserve"> </w:t>
-      </w:r>
-      <w:r>
         <w:rPr>
           <w:b/>
           <w:bCs/>
         </w:rPr>
-        <w:t xml:space="preserve">provably exact</w:t>
-      </w:r>
-      <w:r>
-        <w:t xml:space="preserve"> </w:t>
-      </w:r>
-      <w:r>
-        <w:t xml:space="preserve">foundation. (It also revealed drought normalises against the data range</w:t>
-      </w:r>
-      <w:r>
-        <w:t xml:space="preserve"> </w:t>
-      </w:r>
-      <w:r>
-        <w:t xml:space="preserve">[5,19], not the documented [5,35] - the fact that drives the fixed-reference decision below.)</w:t>
-      </w:r>
-    </w:p>
-    <w:p>
-      <w:r>
-        <w:pict>
-          <v:rect style="width:0;height:1.5pt" o:hralign="center" o:hrstd="t" o:hr="t"/>
-        </w:pict>
-      </w:r>
-    </w:p>
-    <w:bookmarkEnd w:id="12"/>
-    <w:bookmarkEnd w:id="13"/>
-    <w:bookmarkStart w:id="14" w:name="X87c977d7c9661d4c9ebc46b746c4fd5756eb76e"/>
-    <w:p>
-      <w:pPr>
-        <w:pStyle w:val="Heading1"/>
-      </w:pPr>
-      <w:r>
-        <w:t xml:space="preserve">2. The honest current state (the multi-agent audit)</w:t>
-      </w:r>
-    </w:p>
-    <w:p>
-      <w:pPr>
-        <w:pStyle w:val="FirstParagraph"/>
-      </w:pPr>
-      <w:r>
-        <w:t xml:space="preserve">Of the</w:t>
+        <w:t xml:space="preserve">Rechecked across all 53 used indicators, every district: 8664/8664 = 100.00%</w:t>
+      </w:r>
+      <w:r>
+        <w:t xml:space="preserve"> </w:t>
+      </w:r>
+      <w:r>
+        <w:t xml:space="preserve">with Excel half-up</w:t>
+      </w:r>
+      <w:r>
+        <w:t xml:space="preserve"> </w:t>
+      </w:r>
+      <w:r>
+        <w:t xml:space="preserve">rounding (the 1 degenerate</w:t>
+      </w:r>
+      <w:r>
+        <w:t xml:space="preserve"> </w:t>
+      </w:r>
+      <w:r>
+        <w:rPr>
+          <w:rStyle w:val="VerbatimChar"/>
+        </w:rPr>
+        <w:t xml:space="preserve">custom[0,0]</w:t>
+      </w:r>
+      <w:r>
+        <w:t xml:space="preserve"> </w:t>
+      </w:r>
+      <w:r>
+        <w:t xml:space="preserve">indicator and 1 all-</w:t>
+      </w:r>
+      <w:r>
+        <w:t xml:space="preserve">“No data”</w:t>
+      </w:r>
+      <w:r>
+        <w:t xml:space="preserve"> </w:t>
+      </w:r>
+      <w:r>
+        <w:t xml:space="preserve">indicator are caught by the</w:t>
+      </w:r>
+      <w:r>
+        <w:t xml:space="preserve"> </w:t>
+      </w:r>
+      <w:r>
+        <w:t xml:space="preserve">diagnostics, not failures). The spec is a</w:t>
       </w:r>
       <w:r>
         <w:t xml:space="preserve"> </w:t>
@@ -1125,200 +1123,19 @@
           <w:b/>
           <w:bCs/>
         </w:rPr>
-        <w:t xml:space="preserve">32 engine indicators</w:t>
-      </w:r>
-      <w:r>
-        <w:t xml:space="preserve">:</w:t>
-      </w:r>
-      <w:r>
-        <w:t xml:space="preserve"> </w:t>
-      </w:r>
-      <w:r>
-        <w:rPr>
-          <w:b/>
-          <w:bCs/>
-        </w:rPr>
-        <w:t xml:space="preserve">8 genuine local</w:t>
-      </w:r>
-      <w:r>
-        <w:t xml:space="preserve"> </w:t>
-      </w:r>
-      <w:r>
-        <w:t xml:space="preserve">(drought, flood, heatwave, exposure,</w:t>
-      </w:r>
-      <w:r>
-        <w:t xml:space="preserve"> </w:t>
-      </w:r>
-      <w:r>
-        <w:t xml:space="preserve">healthConditions, displaced, wash, earthquake),</w:t>
-      </w:r>
-      <w:r>
-        <w:t xml:space="preserve"> </w:t>
-      </w:r>
-      <w:r>
-        <w:rPr>
-          <w:b/>
-          <w:bCs/>
-        </w:rPr>
-        <w:t xml:space="preserve">9 authored overlays</w:t>
-      </w:r>
-      <w:r>
-        <w:t xml:space="preserve"> </w:t>
-      </w:r>
-      <w:r>
-        <w:t xml:space="preserve">(storms, landslide, coastal,</w:t>
-      </w:r>
-      <w:r>
-        <w:t xml:space="preserve"> </w:t>
-      </w:r>
-      <w:r>
-        <w:t xml:space="preserve">wildfire, volcano, lightning, zoonoses, hazmat, vehicle - hand-assigned grades, no dataset),</w:t>
-      </w:r>
-      <w:r>
-        <w:t xml:space="preserve"> </w:t>
-      </w:r>
-      <w:r>
-        <w:rPr>
-          <w:b/>
-          <w:bCs/>
-        </w:rPr>
-        <w:t xml:space="preserve">14 still</w:t>
-      </w:r>
-      <w:r>
-        <w:rPr>
-          <w:b/>
-          <w:bCs/>
-        </w:rPr>
-        <w:t xml:space="preserve"> </w:t>
-      </w:r>
-      <w:r>
-        <w:rPr>
-          <w:b/>
-          <w:bCs/>
-        </w:rPr>
-        <w:t xml:space="preserve">the global foundation</w:t>
-      </w:r>
-      <w:r>
-        <w:t xml:space="preserve">,</w:t>
-      </w:r>
-      <w:r>
-        <w:t xml:space="preserve"> </w:t>
-      </w:r>
-      <w:r>
-        <w:rPr>
-          <w:b/>
-          <w:bCs/>
-        </w:rPr>
-        <w:t xml:space="preserve">1 missing</w:t>
-      </w:r>
-      <w:r>
-        <w:t xml:space="preserve">. The engine reads only a pre-standardised JSON baked offline plus</w:t>
-      </w:r>
-      <w:r>
-        <w:t xml:space="preserve"> </w:t>
-      </w:r>
-      <w:r>
-        <w:t xml:space="preserve">a single-device localStorage override -</w:t>
-      </w:r>
-      <w:r>
-        <w:t xml:space="preserve"> </w:t>
-      </w:r>
-      <w:r>
-        <w:rPr>
-          <w:b/>
-          <w:bCs/>
-        </w:rPr>
-        <w:t xml:space="preserve">no live sector feed</w:t>
-      </w:r>
-      <w:r>
-        <w:t xml:space="preserve">. Several provenance chips overstate local</w:t>
-      </w:r>
-      <w:r>
-        <w:t xml:space="preserve"> </w:t>
-      </w:r>
-      <w:r>
-        <w:t xml:space="preserve">sourcing (accessHealth/education/habitat claim NBS/MoH but are byte-identical to the global baseline). No</w:t>
-      </w:r>
-      <w:r>
-        <w:t xml:space="preserve"> </w:t>
-      </w:r>
-      <w:r>
-        <w:t xml:space="preserve">CRITICAL math defects (engine is exact); every issue is provenance, ingestion, or resolution. This plan</w:t>
-      </w:r>
-      <w:r>
-        <w:t xml:space="preserve"> </w:t>
-      </w:r>
-      <w:r>
-        <w:t xml:space="preserve">closes all of it.</w:t>
-      </w:r>
-    </w:p>
-    <w:p>
-      <w:r>
-        <w:pict>
-          <v:rect style="width:0;height:1.5pt" o:hralign="center" o:hrstd="t" o:hr="t"/>
-        </w:pict>
-      </w:r>
-    </w:p>
-    <w:bookmarkEnd w:id="14"/>
-    <w:bookmarkStart w:id="15" w:name="Xbb395847df085f1ac86eaa4a17dbb8c9f727ca3"/>
-    <w:p>
-      <w:pPr>
-        <w:pStyle w:val="Heading1"/>
-      </w:pPr>
-      <w:r>
-        <w:t xml:space="preserve">3. The core decision: fixed references (the linchpin)</w:t>
-      </w:r>
-    </w:p>
-    <w:p>
-      <w:pPr>
-        <w:pStyle w:val="FirstParagraph"/>
-      </w:pPr>
-      <w:r>
-        <w:t xml:space="preserve">A data-range reference is bound to the unit set: drought’s [5,19] is the min/max of the</w:t>
-      </w:r>
-      <w:r>
-        <w:t xml:space="preserve"> </w:t>
-      </w:r>
-      <w:r>
-        <w:rPr>
-          <w:b/>
-          <w:bCs/>
-        </w:rPr>
-        <w:t xml:space="preserve">170</w:t>
-      </w:r>
-      <w:r>
-        <w:t xml:space="preserve"> </w:t>
-      </w:r>
-      <w:r>
-        <w:t xml:space="preserve">units;</w:t>
-      </w:r>
-      <w:r>
-        <w:t xml:space="preserve"> </w:t>
-      </w:r>
-      <w:r>
-        <w:t xml:space="preserve">recompute it over</w:t>
-      </w:r>
-      <w:r>
-        <w:t xml:space="preserve"> </w:t>
-      </w:r>
-      <w:r>
-        <w:rPr>
-          <w:b/>
-          <w:bCs/>
-        </w:rPr>
-        <w:t xml:space="preserve">195</w:t>
-      </w:r>
-      <w:r>
-        <w:t xml:space="preserve"> </w:t>
-      </w:r>
-      <w:r>
-        <w:t xml:space="preserve">councils and every score shifts, silently leaving INFORM. A fixed reference</w:t>
-      </w:r>
-      <w:r>
-        <w:t xml:space="preserve"> </w:t>
-      </w:r>
-      <w:r>
-        <w:t xml:space="preserve">gives the same 0-10 at 170, 195, or any resolution. Fixing the references is what simultaneously unlocks:</w:t>
+        <w:t xml:space="preserve">provably exact</w:t>
+      </w:r>
+      <w:r>
+        <w:t xml:space="preserve"> </w:t>
+      </w:r>
+      <w:r>
+        <w:t xml:space="preserve">foundation. Two build requirements surfaced</w:t>
+      </w:r>
+      <w:r>
+        <w:t xml:space="preserve"> </w:t>
+      </w:r>
+      <w:r>
+        <w:t xml:space="preserve">from the recheck:</w:t>
       </w:r>
     </w:p>
     <w:p>
@@ -1334,13 +1151,52 @@
           <w:b/>
           <w:bCs/>
         </w:rPr>
-        <w:t xml:space="preserve">195-council scaling</w:t>
-      </w:r>
-      <w:r>
-        <w:t xml:space="preserve"> </w:t>
-      </w:r>
-      <w:r>
-        <w:t xml:space="preserve">- a council’s score does not depend on which units are present.</w:t>
+        <w:t xml:space="preserve">Excel half-up rounding</w:t>
+      </w:r>
+      <w:r>
+        <w:t xml:space="preserve"> </w:t>
+      </w:r>
+      <w:r>
+        <w:t xml:space="preserve">(</w:t>
+      </w:r>
+      <w:r>
+        <w:rPr>
+          <w:rStyle w:val="VerbatimChar"/>
+        </w:rPr>
+        <w:t xml:space="preserve">ROUND(5.25,1)=5.3</w:t>
+      </w:r>
+      <w:r>
+        <w:t xml:space="preserve">) - JS</w:t>
+      </w:r>
+      <w:r>
+        <w:t xml:space="preserve"> </w:t>
+      </w:r>
+      <w:r>
+        <w:rPr>
+          <w:rStyle w:val="VerbatimChar"/>
+        </w:rPr>
+        <w:t xml:space="preserve">Math.round</w:t>
+      </w:r>
+      <w:r>
+        <w:t xml:space="preserve"> </w:t>
+      </w:r>
+      <w:r>
+        <w:t xml:space="preserve">already does this; a naive Python</w:t>
+      </w:r>
+      <w:r>
+        <w:t xml:space="preserve"> </w:t>
+      </w:r>
+      <w:r>
+        <w:rPr>
+          <w:rStyle w:val="VerbatimChar"/>
+        </w:rPr>
+        <w:t xml:space="preserve">round()</w:t>
+      </w:r>
+      <w:r>
+        <w:t xml:space="preserve"> </w:t>
+      </w:r>
+      <w:r>
+        <w:t xml:space="preserve">does not.</w:t>
       </w:r>
     </w:p>
     <w:p>
@@ -1356,77 +1212,29 @@
           <w:b/>
           <w:bCs/>
         </w:rPr>
-        <w:t xml:space="preserve">Any-unit indicators</w:t>
-      </w:r>
-      <w:r>
-        <w:t xml:space="preserve"> </w:t>
-      </w:r>
-      <w:r>
-        <w:t xml:space="preserve">- each self-standardises against its own fixed reference.</w:t>
-      </w:r>
-    </w:p>
-    <w:p>
-      <w:pPr>
-        <w:pStyle w:val="Compact"/>
-        <w:numPr>
-          <w:ilvl w:val="0"/>
-          <w:numId w:val="1003"/>
-        </w:numPr>
-      </w:pPr>
+        <w:t xml:space="preserve">Freeze the</w:t>
+      </w:r>
       <w:r>
         <w:rPr>
           <w:b/>
           <w:bCs/>
         </w:rPr>
-        <w:t xml:space="preserve">Sensitive-safe submission</w:t>
-      </w:r>
-      <w:r>
-        <w:t xml:space="preserve"> </w:t>
-      </w:r>
-      <w:r>
-        <w:t xml:space="preserve">- a sector can standardise locally (no need for the whole country’s data),</w:t>
-      </w:r>
-      <w:r>
-        <w:t xml:space="preserve"> </w:t>
-      </w:r>
-      <w:r>
-        <w:t xml:space="preserve">so it can submit a bare 0-10 and keep its raw at home.</w:t>
-      </w:r>
-    </w:p>
-    <w:p>
-      <w:pPr>
-        <w:pStyle w:val="FirstParagraph"/>
-      </w:pPr>
+        <w:t xml:space="preserve"> </w:t>
+      </w:r>
       <w:r>
         <w:rPr>
           <w:b/>
           <w:bCs/>
-        </w:rPr>
-        <w:t xml:space="preserve">Action:</w:t>
-      </w:r>
-      <w:r>
-        <w:t xml:space="preserve"> </w:t>
-      </w:r>
-      <w:r>
-        <w:t xml:space="preserve">adopt the</w:t>
-      </w:r>
-      <w:r>
-        <w:t xml:space="preserve"> </w:t>
+          <w:i/>
+          <w:iCs/>
+        </w:rPr>
+        <w:t xml:space="preserve">resolved</w:t>
       </w:r>
       <w:r>
         <w:rPr>
           <w:b/>
           <w:bCs/>
         </w:rPr>
-        <w:t xml:space="preserve">17 custom references</w:t>
-      </w:r>
-      <w:r>
-        <w:t xml:space="preserve"> </w:t>
-      </w:r>
-      <w:r>
-        <w:t xml:space="preserve">verbatim from the workbook; convert the</w:t>
-      </w:r>
-      <w:r>
         <w:t xml:space="preserve"> </w:t>
       </w:r>
       <w:r>
@@ -1434,37 +1242,110 @@
           <w:b/>
           <w:bCs/>
         </w:rPr>
-        <w:t xml:space="preserve">36 data-range</w:t>
-      </w:r>
-      <w:r>
-        <w:t xml:space="preserve"> </w:t>
-      </w:r>
-      <w:r>
-        <w:t xml:space="preserve">references to fixed pairs, each sourced from a documented basis (the workbook’s current data range frozen,</w:t>
-      </w:r>
-      <w:r>
-        <w:t xml:space="preserve"> </w:t>
-      </w:r>
-      <w:r>
-        <w:t xml:space="preserve">or a policy/literature bound), recorded in the spec. This is the one place we move beyond</w:t>
-      </w:r>
-      <w:r>
-        <w:t xml:space="preserve"> </w:t>
-      </w:r>
-      <w:r>
-        <w:t xml:space="preserve">“copy the</w:t>
-      </w:r>
-      <w:r>
-        <w:t xml:space="preserve"> </w:t>
-      </w:r>
-      <w:r>
-        <w:t xml:space="preserve">workbook”</w:t>
-      </w:r>
-      <w:r>
-        <w:t xml:space="preserve"> </w:t>
-      </w:r>
-      <w:r>
-        <w:t xml:space="preserve">- and it is required by the 195 mandate, documented as such.</w:t>
+        <w:t xml:space="preserve">reference</w:t>
+      </w:r>
+      <w:r>
+        <w:t xml:space="preserve"> </w:t>
+      </w:r>
+      <w:r>
+        <w:t xml:space="preserve">- for data-range indicators that is the proc-22 data range</w:t>
+      </w:r>
+      <w:r>
+        <w:t xml:space="preserve"> </w:t>
+      </w:r>
+      <w:r>
+        <w:t xml:space="preserve">(drought</w:t>
+      </w:r>
+      <w:r>
+        <w:t xml:space="preserve"> </w:t>
+      </w:r>
+      <w:r>
+        <w:rPr>
+          <w:rStyle w:val="VerbatimChar"/>
+        </w:rPr>
+        <w:t xml:space="preserve">[5,19]</w:t>
+      </w:r>
+      <w:r>
+        <w:t xml:space="preserve">),</w:t>
+      </w:r>
+      <w:r>
+        <w:t xml:space="preserve"> </w:t>
+      </w:r>
+      <w:r>
+        <w:rPr>
+          <w:i/>
+          <w:iCs/>
+        </w:rPr>
+        <w:t xml:space="preserve">not</w:t>
+      </w:r>
+      <w:r>
+        <w:t xml:space="preserve"> </w:t>
+      </w:r>
+      <w:r>
+        <w:t xml:space="preserve">the leftover</w:t>
+      </w:r>
+      <w:r>
+        <w:t xml:space="preserve"> </w:t>
+      </w:r>
+      <w:r>
+        <w:t xml:space="preserve">“custom Max/Min”</w:t>
+      </w:r>
+      <w:r>
+        <w:t xml:space="preserve"> </w:t>
+      </w:r>
+      <w:r>
+        <w:t xml:space="preserve">cells. Now recorded as</w:t>
+      </w:r>
+      <w:r>
+        <w:t xml:space="preserve"> </w:t>
+      </w:r>
+      <w:r>
+        <w:rPr>
+          <w:rStyle w:val="VerbatimChar"/>
+        </w:rPr>
+        <w:t xml:space="preserve">resolved_min</w:t>
+      </w:r>
+      <w:r>
+        <w:t xml:space="preserve"> </w:t>
+      </w:r>
+      <w:r>
+        <w:t xml:space="preserve">/</w:t>
+      </w:r>
+      <w:r>
+        <w:t xml:space="preserve"> </w:t>
+      </w:r>
+      <w:r>
+        <w:rPr>
+          <w:rStyle w:val="VerbatimChar"/>
+        </w:rPr>
+        <w:t xml:space="preserve">resolved_max</w:t>
+      </w:r>
+      <w:r>
+        <w:t xml:space="preserve"> </w:t>
+      </w:r>
+      <w:r>
+        <w:t xml:space="preserve">in</w:t>
+      </w:r>
+      <w:r>
+        <w:t xml:space="preserve"> </w:t>
+      </w:r>
+      <w:r>
+        <w:rPr>
+          <w:rStyle w:val="VerbatimChar"/>
+        </w:rPr>
+        <w:t xml:space="preserve">inform_indicator_spec.csv</w:t>
+      </w:r>
+      <w:r>
+        <w:t xml:space="preserve"> </w:t>
+      </w:r>
+      <w:r>
+        <w:t xml:space="preserve">(this would have silently broken 36 indicators if we had</w:t>
+      </w:r>
+      <w:r>
+        <w:t xml:space="preserve"> </w:t>
+      </w:r>
+      <w:r>
+        <w:t xml:space="preserve">built on the raw custom columns).</w:t>
       </w:r>
     </w:p>
     <w:p>
@@ -1474,23 +1355,226 @@
         </w:pict>
       </w:r>
     </w:p>
-    <w:bookmarkEnd w:id="15"/>
-    <w:bookmarkStart w:id="20" w:name="the-architecture"/>
+    <w:bookmarkEnd w:id="12"/>
+    <w:bookmarkEnd w:id="13"/>
+    <w:bookmarkStart w:id="14" w:name="X87c977d7c9661d4c9ebc46b746c4fd5756eb76e"/>
     <w:p>
       <w:pPr>
         <w:pStyle w:val="Heading1"/>
       </w:pPr>
       <w:r>
-        <w:t xml:space="preserve">4. The architecture</w:t>
-      </w:r>
-    </w:p>
-    <w:bookmarkStart w:id="16" w:name="the-standardisation-engine-spec-driven"/>
-    <w:p>
-      <w:pPr>
-        <w:pStyle w:val="Heading2"/>
-      </w:pPr>
-      <w:r>
-        <w:t xml:space="preserve">4.1 The standardisation engine (spec-driven)</w:t>
+        <w:t xml:space="preserve">2. The honest current state (the multi-agent audit)</w:t>
+      </w:r>
+    </w:p>
+    <w:p>
+      <w:pPr>
+        <w:pStyle w:val="FirstParagraph"/>
+      </w:pPr>
+      <w:r>
+        <w:t xml:space="preserve">Of the</w:t>
+      </w:r>
+      <w:r>
+        <w:t xml:space="preserve"> </w:t>
+      </w:r>
+      <w:r>
+        <w:rPr>
+          <w:b/>
+          <w:bCs/>
+        </w:rPr>
+        <w:t xml:space="preserve">32 engine indicators</w:t>
+      </w:r>
+      <w:r>
+        <w:t xml:space="preserve">:</w:t>
+      </w:r>
+      <w:r>
+        <w:t xml:space="preserve"> </w:t>
+      </w:r>
+      <w:r>
+        <w:rPr>
+          <w:b/>
+          <w:bCs/>
+        </w:rPr>
+        <w:t xml:space="preserve">8 genuine local</w:t>
+      </w:r>
+      <w:r>
+        <w:t xml:space="preserve"> </w:t>
+      </w:r>
+      <w:r>
+        <w:t xml:space="preserve">(drought, flood, heatwave, exposure,</w:t>
+      </w:r>
+      <w:r>
+        <w:t xml:space="preserve"> </w:t>
+      </w:r>
+      <w:r>
+        <w:t xml:space="preserve">healthConditions, displaced, wash, earthquake),</w:t>
+      </w:r>
+      <w:r>
+        <w:t xml:space="preserve"> </w:t>
+      </w:r>
+      <w:r>
+        <w:rPr>
+          <w:b/>
+          <w:bCs/>
+        </w:rPr>
+        <w:t xml:space="preserve">9 authored overlays</w:t>
+      </w:r>
+      <w:r>
+        <w:t xml:space="preserve"> </w:t>
+      </w:r>
+      <w:r>
+        <w:t xml:space="preserve">(storms, landslide, coastal,</w:t>
+      </w:r>
+      <w:r>
+        <w:t xml:space="preserve"> </w:t>
+      </w:r>
+      <w:r>
+        <w:t xml:space="preserve">wildfire, volcano, lightning, zoonoses, hazmat, vehicle - hand-assigned grades, no dataset),</w:t>
+      </w:r>
+      <w:r>
+        <w:t xml:space="preserve"> </w:t>
+      </w:r>
+      <w:r>
+        <w:rPr>
+          <w:b/>
+          <w:bCs/>
+        </w:rPr>
+        <w:t xml:space="preserve">14 still</w:t>
+      </w:r>
+      <w:r>
+        <w:rPr>
+          <w:b/>
+          <w:bCs/>
+        </w:rPr>
+        <w:t xml:space="preserve"> </w:t>
+      </w:r>
+      <w:r>
+        <w:rPr>
+          <w:b/>
+          <w:bCs/>
+        </w:rPr>
+        <w:t xml:space="preserve">the global foundation</w:t>
+      </w:r>
+      <w:r>
+        <w:t xml:space="preserve">,</w:t>
+      </w:r>
+      <w:r>
+        <w:t xml:space="preserve"> </w:t>
+      </w:r>
+      <w:r>
+        <w:rPr>
+          <w:b/>
+          <w:bCs/>
+        </w:rPr>
+        <w:t xml:space="preserve">1 missing</w:t>
+      </w:r>
+      <w:r>
+        <w:t xml:space="preserve">. The engine reads only a pre-standardised JSON baked offline plus</w:t>
+      </w:r>
+      <w:r>
+        <w:t xml:space="preserve"> </w:t>
+      </w:r>
+      <w:r>
+        <w:t xml:space="preserve">a single-device localStorage override -</w:t>
+      </w:r>
+      <w:r>
+        <w:t xml:space="preserve"> </w:t>
+      </w:r>
+      <w:r>
+        <w:rPr>
+          <w:b/>
+          <w:bCs/>
+        </w:rPr>
+        <w:t xml:space="preserve">no live sector feed</w:t>
+      </w:r>
+      <w:r>
+        <w:t xml:space="preserve">. Several provenance chips overstate local</w:t>
+      </w:r>
+      <w:r>
+        <w:t xml:space="preserve"> </w:t>
+      </w:r>
+      <w:r>
+        <w:t xml:space="preserve">sourcing (accessHealth/education/habitat claim NBS/MoH but are byte-identical to the global baseline). No</w:t>
+      </w:r>
+      <w:r>
+        <w:t xml:space="preserve"> </w:t>
+      </w:r>
+      <w:r>
+        <w:t xml:space="preserve">CRITICAL math defects (engine is exact); every issue is provenance, ingestion, or resolution. This plan</w:t>
+      </w:r>
+      <w:r>
+        <w:t xml:space="preserve"> </w:t>
+      </w:r>
+      <w:r>
+        <w:t xml:space="preserve">closes all of it.</w:t>
+      </w:r>
+    </w:p>
+    <w:p>
+      <w:r>
+        <w:pict>
+          <v:rect style="width:0;height:1.5pt" o:hralign="center" o:hrstd="t" o:hr="t"/>
+        </w:pict>
+      </w:r>
+    </w:p>
+    <w:bookmarkEnd w:id="14"/>
+    <w:bookmarkStart w:id="15" w:name="Xbb395847df085f1ac86eaa4a17dbb8c9f727ca3"/>
+    <w:p>
+      <w:pPr>
+        <w:pStyle w:val="Heading1"/>
+      </w:pPr>
+      <w:r>
+        <w:t xml:space="preserve">3. The core decision: fixed references (the linchpin)</w:t>
+      </w:r>
+    </w:p>
+    <w:p>
+      <w:pPr>
+        <w:pStyle w:val="FirstParagraph"/>
+      </w:pPr>
+      <w:r>
+        <w:t xml:space="preserve">A data-range reference is bound to the unit set: drought’s [5,19] is the min/max of the</w:t>
+      </w:r>
+      <w:r>
+        <w:t xml:space="preserve"> </w:t>
+      </w:r>
+      <w:r>
+        <w:rPr>
+          <w:b/>
+          <w:bCs/>
+        </w:rPr>
+        <w:t xml:space="preserve">170</w:t>
+      </w:r>
+      <w:r>
+        <w:t xml:space="preserve"> </w:t>
+      </w:r>
+      <w:r>
+        <w:t xml:space="preserve">units;</w:t>
+      </w:r>
+      <w:r>
+        <w:t xml:space="preserve"> </w:t>
+      </w:r>
+      <w:r>
+        <w:t xml:space="preserve">recompute it over</w:t>
+      </w:r>
+      <w:r>
+        <w:t xml:space="preserve"> </w:t>
+      </w:r>
+      <w:r>
+        <w:rPr>
+          <w:b/>
+          <w:bCs/>
+        </w:rPr>
+        <w:t xml:space="preserve">195</w:t>
+      </w:r>
+      <w:r>
+        <w:t xml:space="preserve"> </w:t>
+      </w:r>
+      <w:r>
+        <w:t xml:space="preserve">councils and every score shifts, silently leaving INFORM. A fixed reference</w:t>
+      </w:r>
+      <w:r>
+        <w:t xml:space="preserve"> </w:t>
+      </w:r>
+      <w:r>
+        <w:t xml:space="preserve">gives the same 0-10 at 170, 195, or any resolution. Fixing the references is what simultaneously unlocks:</w:t>
       </w:r>
     </w:p>
     <w:p>
@@ -1503,36 +1587,16 @@
       </w:pPr>
       <w:r>
         <w:rPr>
-          <w:rStyle w:val="VerbatimChar"/>
-        </w:rPr>
-        <w:t xml:space="preserve">indicatorSpec</w:t>
-      </w:r>
-      <w:r>
-        <w:t xml:space="preserve"> </w:t>
-      </w:r>
-      <w:r>
-        <w:t xml:space="preserve">loaded from</w:t>
-      </w:r>
-      <w:r>
-        <w:t xml:space="preserve"> </w:t>
-      </w:r>
-      <w:r>
-        <w:rPr>
-          <w:rStyle w:val="VerbatimChar"/>
-        </w:rPr>
-        <w:t xml:space="preserve">inform_indicator_spec.csv</w:t>
-      </w:r>
-      <w:r>
-        <w:t xml:space="preserve"> </w:t>
-      </w:r>
-      <w:r>
-        <w:t xml:space="preserve">(denominator, transform, reference, sign, Use,</w:t>
-      </w:r>
-      <w:r>
-        <w:t xml:space="preserve"> </w:t>
-      </w:r>
-      <w:r>
-        <w:t xml:space="preserve">resolution) - the engine reads it, never hardcodes.</w:t>
+          <w:b/>
+          <w:bCs/>
+        </w:rPr>
+        <w:t xml:space="preserve">195-council scaling</w:t>
+      </w:r>
+      <w:r>
+        <w:t xml:space="preserve"> </w:t>
+      </w:r>
+      <w:r>
+        <w:t xml:space="preserve">- a council’s score does not depend on which units are present.</w:t>
       </w:r>
     </w:p>
     <w:p>
@@ -1545,15 +1609,16 @@
       </w:pPr>
       <w:r>
         <w:rPr>
-          <w:rStyle w:val="VerbatimChar"/>
-        </w:rPr>
-        <w:t xml:space="preserve">standardise(raw, spec)</w:t>
-      </w:r>
-      <w:r>
-        <w:t xml:space="preserve"> </w:t>
-      </w:r>
-      <w:r>
-        <w:t xml:space="preserve">= stages 2-5 (proven exact).</w:t>
+          <w:b/>
+          <w:bCs/>
+        </w:rPr>
+        <w:t xml:space="preserve">Any-unit indicators</w:t>
+      </w:r>
+      <w:r>
+        <w:t xml:space="preserve"> </w:t>
+      </w:r>
+      <w:r>
+        <w:t xml:space="preserve">- each self-standardises against its own fixed reference.</w:t>
       </w:r>
     </w:p>
     <w:p>
@@ -1562,6 +1627,298 @@
         <w:numPr>
           <w:ilvl w:val="0"/>
           <w:numId w:val="1004"/>
+        </w:numPr>
+      </w:pPr>
+      <w:r>
+        <w:rPr>
+          <w:b/>
+          <w:bCs/>
+        </w:rPr>
+        <w:t xml:space="preserve">Sensitive-safe submission</w:t>
+      </w:r>
+      <w:r>
+        <w:t xml:space="preserve"> </w:t>
+      </w:r>
+      <w:r>
+        <w:t xml:space="preserve">- a sector can standardise locally (no need for the whole country’s data),</w:t>
+      </w:r>
+      <w:r>
+        <w:t xml:space="preserve"> </w:t>
+      </w:r>
+      <w:r>
+        <w:t xml:space="preserve">so it can submit a bare 0-10 and keep its raw at home.</w:t>
+      </w:r>
+    </w:p>
+    <w:p>
+      <w:pPr>
+        <w:pStyle w:val="FirstParagraph"/>
+      </w:pPr>
+      <w:r>
+        <w:rPr>
+          <w:b/>
+          <w:bCs/>
+        </w:rPr>
+        <w:t xml:space="preserve">Action:</w:t>
+      </w:r>
+      <w:r>
+        <w:t xml:space="preserve"> </w:t>
+      </w:r>
+      <w:r>
+        <w:t xml:space="preserve">the references to freeze are already extracted -</w:t>
+      </w:r>
+      <w:r>
+        <w:t xml:space="preserve"> </w:t>
+      </w:r>
+      <w:r>
+        <w:rPr>
+          <w:rStyle w:val="VerbatimChar"/>
+        </w:rPr>
+        <w:t xml:space="preserve">resolved_min</w:t>
+      </w:r>
+      <w:r>
+        <w:t xml:space="preserve"> </w:t>
+      </w:r>
+      <w:r>
+        <w:t xml:space="preserve">/</w:t>
+      </w:r>
+      <w:r>
+        <w:t xml:space="preserve"> </w:t>
+      </w:r>
+      <w:r>
+        <w:rPr>
+          <w:rStyle w:val="VerbatimChar"/>
+        </w:rPr>
+        <w:t xml:space="preserve">resolved_max</w:t>
+      </w:r>
+      <w:r>
+        <w:t xml:space="preserve"> </w:t>
+      </w:r>
+      <w:r>
+        <w:t xml:space="preserve">in</w:t>
+      </w:r>
+      <w:r>
+        <w:t xml:space="preserve"> </w:t>
+      </w:r>
+      <w:r>
+        <w:rPr>
+          <w:rStyle w:val="VerbatimChar"/>
+        </w:rPr>
+        <w:t xml:space="preserve">inform_indicator_spec.csv</w:t>
+      </w:r>
+      <w:r>
+        <w:t xml:space="preserve">: the</w:t>
+      </w:r>
+      <w:r>
+        <w:t xml:space="preserve"> </w:t>
+      </w:r>
+      <w:r>
+        <w:rPr>
+          <w:b/>
+          <w:bCs/>
+        </w:rPr>
+        <w:t xml:space="preserve">17 custom</w:t>
+      </w:r>
+      <w:r>
+        <w:t xml:space="preserve"> </w:t>
+      </w:r>
+      <w:r>
+        <w:t xml:space="preserve">pairs verbatim, and the</w:t>
+      </w:r>
+      <w:r>
+        <w:t xml:space="preserve"> </w:t>
+      </w:r>
+      <w:r>
+        <w:rPr>
+          <w:b/>
+          <w:bCs/>
+        </w:rPr>
+        <w:t xml:space="preserve">36 data-range</w:t>
+      </w:r>
+      <w:r>
+        <w:t xml:space="preserve"> </w:t>
+      </w:r>
+      <w:r>
+        <w:t xml:space="preserve">pairs frozen at</w:t>
+      </w:r>
+      <w:r>
+        <w:t xml:space="preserve"> </w:t>
+      </w:r>
+      <w:r>
+        <w:t xml:space="preserve">the proc-22 data range (e.g. drought</w:t>
+      </w:r>
+      <w:r>
+        <w:t xml:space="preserve"> </w:t>
+      </w:r>
+      <w:r>
+        <w:rPr>
+          <w:rStyle w:val="VerbatimChar"/>
+        </w:rPr>
+        <w:t xml:space="preserve">[5,19]</w:t>
+      </w:r>
+      <w:r>
+        <w:t xml:space="preserve">). At 195, a council standardises against the</w:t>
+      </w:r>
+      <w:r>
+        <w:t xml:space="preserve"> </w:t>
+      </w:r>
+      <w:r>
+        <w:rPr>
+          <w:i/>
+          <w:iCs/>
+        </w:rPr>
+        <w:t xml:space="preserve">frozen</w:t>
+      </w:r>
+      <w:r>
+        <w:t xml:space="preserve"> </w:t>
+      </w:r>
+      <w:r>
+        <w:t xml:space="preserve">reference, giving the same 0-10 independent of how many units are present - and this is</w:t>
+      </w:r>
+      <w:r>
+        <w:t xml:space="preserve"> </w:t>
+      </w:r>
+      <w:r>
+        <w:rPr>
+          <w:b/>
+          <w:bCs/>
+        </w:rPr>
+        <w:t xml:space="preserve">proven</w:t>
+      </w:r>
+      <w:r>
+        <w:t xml:space="preserve">, since</w:t>
+      </w:r>
+      <w:r>
+        <w:t xml:space="preserve"> </w:t>
+      </w:r>
+      <w:r>
+        <w:t xml:space="preserve">those exact references reproduce the 170 workbook at 100.00%. This is the one place we move beyond</w:t>
+      </w:r>
+      <w:r>
+        <w:t xml:space="preserve"> </w:t>
+      </w:r>
+      <w:r>
+        <w:t xml:space="preserve">“copy</w:t>
+      </w:r>
+      <w:r>
+        <w:t xml:space="preserve"> </w:t>
+      </w:r>
+      <w:r>
+        <w:t xml:space="preserve">the workbook”</w:t>
+      </w:r>
+      <w:r>
+        <w:t xml:space="preserve"> </w:t>
+      </w:r>
+      <w:r>
+        <w:t xml:space="preserve">verbatim (a data-range becomes a fixed pair); it is required by the 195 mandate and</w:t>
+      </w:r>
+      <w:r>
+        <w:t xml:space="preserve"> </w:t>
+      </w:r>
+      <w:r>
+        <w:t xml:space="preserve">documented as such. (Where a policy/literature bound is more defensible than the frozen data range - e.g.</w:t>
+      </w:r>
+      <w:r>
+        <w:t xml:space="preserve"> </w:t>
+      </w:r>
+      <w:r>
+        <w:t xml:space="preserve">0-100% for a rate - it can replace the frozen pair per indicator, recorded in the spec.)</w:t>
+      </w:r>
+    </w:p>
+    <w:p>
+      <w:r>
+        <w:pict>
+          <v:rect style="width:0;height:1.5pt" o:hralign="center" o:hrstd="t" o:hr="t"/>
+        </w:pict>
+      </w:r>
+    </w:p>
+    <w:bookmarkEnd w:id="15"/>
+    <w:bookmarkStart w:id="20" w:name="the-architecture"/>
+    <w:p>
+      <w:pPr>
+        <w:pStyle w:val="Heading1"/>
+      </w:pPr>
+      <w:r>
+        <w:t xml:space="preserve">4. The architecture</w:t>
+      </w:r>
+    </w:p>
+    <w:bookmarkStart w:id="16" w:name="the-standardisation-engine-spec-driven"/>
+    <w:p>
+      <w:pPr>
+        <w:pStyle w:val="Heading2"/>
+      </w:pPr>
+      <w:r>
+        <w:t xml:space="preserve">4.1 The standardisation engine (spec-driven)</w:t>
+      </w:r>
+    </w:p>
+    <w:p>
+      <w:pPr>
+        <w:pStyle w:val="Compact"/>
+        <w:numPr>
+          <w:ilvl w:val="0"/>
+          <w:numId w:val="1005"/>
+        </w:numPr>
+      </w:pPr>
+      <w:r>
+        <w:rPr>
+          <w:rStyle w:val="VerbatimChar"/>
+        </w:rPr>
+        <w:t xml:space="preserve">indicatorSpec</w:t>
+      </w:r>
+      <w:r>
+        <w:t xml:space="preserve"> </w:t>
+      </w:r>
+      <w:r>
+        <w:t xml:space="preserve">loaded from</w:t>
+      </w:r>
+      <w:r>
+        <w:t xml:space="preserve"> </w:t>
+      </w:r>
+      <w:r>
+        <w:rPr>
+          <w:rStyle w:val="VerbatimChar"/>
+        </w:rPr>
+        <w:t xml:space="preserve">inform_indicator_spec.csv</w:t>
+      </w:r>
+      <w:r>
+        <w:t xml:space="preserve"> </w:t>
+      </w:r>
+      <w:r>
+        <w:t xml:space="preserve">(denominator, transform, reference, sign, Use,</w:t>
+      </w:r>
+      <w:r>
+        <w:t xml:space="preserve"> </w:t>
+      </w:r>
+      <w:r>
+        <w:t xml:space="preserve">resolution) - the engine reads it, never hardcodes.</w:t>
+      </w:r>
+    </w:p>
+    <w:p>
+      <w:pPr>
+        <w:pStyle w:val="Compact"/>
+        <w:numPr>
+          <w:ilvl w:val="0"/>
+          <w:numId w:val="1005"/>
+        </w:numPr>
+      </w:pPr>
+      <w:r>
+        <w:rPr>
+          <w:rStyle w:val="VerbatimChar"/>
+        </w:rPr>
+        <w:t xml:space="preserve">standardise(raw, spec)</w:t>
+      </w:r>
+      <w:r>
+        <w:t xml:space="preserve"> </w:t>
+      </w:r>
+      <w:r>
+        <w:t xml:space="preserve">= stages 2-5 (proven exact).</w:t>
+      </w:r>
+    </w:p>
+    <w:p>
+      <w:pPr>
+        <w:pStyle w:val="Compact"/>
+        <w:numPr>
+          <w:ilvl w:val="0"/>
+          <w:numId w:val="1005"/>
         </w:numPr>
       </w:pPr>
       <w:r>
@@ -3385,57 +3742,11 @@
         <w:pStyle w:val="Compact"/>
         <w:numPr>
           <w:ilvl w:val="0"/>
-          <w:numId w:val="1005"/>
+          <w:numId w:val="1006"/>
         </w:numPr>
       </w:pPr>
       <w:r>
         <w:t xml:space="preserve">The aggregation engine (AVERAGE / scaled GEOMEAN / cube-root) - unchanged, 0/195.</w:t>
-      </w:r>
-    </w:p>
-    <w:p>
-      <w:pPr>
-        <w:pStyle w:val="Compact"/>
-        <w:numPr>
-          <w:ilvl w:val="0"/>
-          <w:numId w:val="1005"/>
-        </w:numPr>
-      </w:pPr>
-      <w:r>
-        <w:t xml:space="preserve">The standardisation formulas (stages 2-5) - proven to reproduce the workbook.</w:t>
-      </w:r>
-    </w:p>
-    <w:p>
-      <w:pPr>
-        <w:pStyle w:val="Compact"/>
-        <w:numPr>
-          <w:ilvl w:val="0"/>
-          <w:numId w:val="1005"/>
-        </w:numPr>
-      </w:pPr>
-      <w:r>
-        <w:t xml:space="preserve">National figures kept official; raise-only respected where it applies; missing = excluded.</w:t>
-      </w:r>
-    </w:p>
-    <w:p>
-      <w:pPr>
-        <w:pStyle w:val="Compact"/>
-        <w:numPr>
-          <w:ilvl w:val="0"/>
-          <w:numId w:val="1005"/>
-        </w:numPr>
-      </w:pPr>
-      <w:r>
-        <w:t xml:space="preserve">The golden fixture (the workbook’s own cached rows) remains the regression guard for both engines.</w:t>
-      </w:r>
-    </w:p>
-    <w:bookmarkEnd w:id="24"/>
-    <w:bookmarkStart w:id="25" w:name="verification-how-each-phase-earns-trust"/>
-    <w:p>
-      <w:pPr>
-        <w:pStyle w:val="Heading1"/>
-      </w:pPr>
-      <w:r>
-        <w:t xml:space="preserve">9. Verification (how each phase earns trust)</w:t>
       </w:r>
     </w:p>
     <w:p>
@@ -3447,32 +3758,7 @@
         </w:numPr>
       </w:pPr>
       <w:r>
-        <w:rPr>
-          <w:b/>
-          <w:bCs/>
-        </w:rPr>
-        <w:t xml:space="preserve">Golden test</w:t>
-      </w:r>
-      <w:r>
-        <w:t xml:space="preserve"> </w:t>
-      </w:r>
-      <w:r>
-        <w:t xml:space="preserve">-</w:t>
-      </w:r>
-      <w:r>
-        <w:t xml:space="preserve"> </w:t>
-      </w:r>
-      <w:r>
-        <w:rPr>
-          <w:rStyle w:val="VerbatimChar"/>
-        </w:rPr>
-        <w:t xml:space="preserve">standardise + aggregate</w:t>
-      </w:r>
-      <w:r>
-        <w:t xml:space="preserve"> </w:t>
-      </w:r>
-      <w:r>
-        <w:t xml:space="preserve">reproduces the workbook’s cached 0-10 / category / risk.</w:t>
+        <w:t xml:space="preserve">The standardisation formulas (stages 2-5) - proven to reproduce the workbook.</w:t>
       </w:r>
     </w:p>
     <w:p>
@@ -3484,17 +3770,7 @@
         </w:numPr>
       </w:pPr>
       <w:r>
-        <w:rPr>
-          <w:b/>
-          <w:bCs/>
-        </w:rPr>
-        <w:t xml:space="preserve">0/195 engine check</w:t>
-      </w:r>
-      <w:r>
-        <w:t xml:space="preserve"> </w:t>
-      </w:r>
-      <w:r>
-        <w:t xml:space="preserve">- every council’s hazard.total and risk equal the literal Excel formulas.</w:t>
+        <w:t xml:space="preserve">National figures kept official; raise-only respected where it applies; missing = excluded.</w:t>
       </w:r>
     </w:p>
     <w:p>
@@ -3506,17 +3782,17 @@
         </w:numPr>
       </w:pPr>
       <w:r>
-        <w:rPr>
-          <w:b/>
-          <w:bCs/>
-        </w:rPr>
-        <w:t xml:space="preserve">Spec-reproduces-INFORM</w:t>
-      </w:r>
-      <w:r>
-        <w:t xml:space="preserve"> </w:t>
-      </w:r>
-      <w:r>
-        <w:t xml:space="preserve">- the all-170 proof, extended to every used indicator before Phase 2 ships.</w:t>
+        <w:t xml:space="preserve">The golden fixture (the workbook’s own cached rows) remains the regression guard for both engines.</w:t>
+      </w:r>
+    </w:p>
+    <w:bookmarkEnd w:id="24"/>
+    <w:bookmarkStart w:id="25" w:name="verification-how-each-phase-earns-trust"/>
+    <w:p>
+      <w:pPr>
+        <w:pStyle w:val="Heading1"/>
+      </w:pPr>
+      <w:r>
+        <w:t xml:space="preserve">9. Verification (how each phase earns trust)</w:t>
       </w:r>
     </w:p>
     <w:p>
@@ -3524,7 +3800,7 @@
         <w:pStyle w:val="Compact"/>
         <w:numPr>
           <w:ilvl w:val="0"/>
-          <w:numId w:val="1006"/>
+          <w:numId w:val="1007"/>
         </w:numPr>
       </w:pPr>
       <w:r>
@@ -3532,13 +3808,28 @@
           <w:b/>
           <w:bCs/>
         </w:rPr>
-        <w:t xml:space="preserve">Per-indicator validation</w:t>
-      </w:r>
-      <w:r>
-        <w:t xml:space="preserve"> </w:t>
-      </w:r>
-      <w:r>
-        <w:t xml:space="preserve">- type/range/resolution enforced at entry; ERROR flags surfaced.</w:t>
+        <w:t xml:space="preserve">Golden test</w:t>
+      </w:r>
+      <w:r>
+        <w:t xml:space="preserve"> </w:t>
+      </w:r>
+      <w:r>
+        <w:t xml:space="preserve">-</w:t>
+      </w:r>
+      <w:r>
+        <w:t xml:space="preserve"> </w:t>
+      </w:r>
+      <w:r>
+        <w:rPr>
+          <w:rStyle w:val="VerbatimChar"/>
+        </w:rPr>
+        <w:t xml:space="preserve">standardise + aggregate</w:t>
+      </w:r>
+      <w:r>
+        <w:t xml:space="preserve"> </w:t>
+      </w:r>
+      <w:r>
+        <w:t xml:space="preserve">reproduces the workbook’s cached 0-10 / category / risk.</w:t>
       </w:r>
     </w:p>
     <w:p>
@@ -3546,7 +3837,73 @@
         <w:pStyle w:val="Compact"/>
         <w:numPr>
           <w:ilvl w:val="0"/>
-          <w:numId w:val="1006"/>
+          <w:numId w:val="1007"/>
+        </w:numPr>
+      </w:pPr>
+      <w:r>
+        <w:rPr>
+          <w:b/>
+          <w:bCs/>
+        </w:rPr>
+        <w:t xml:space="preserve">0/195 engine check</w:t>
+      </w:r>
+      <w:r>
+        <w:t xml:space="preserve"> </w:t>
+      </w:r>
+      <w:r>
+        <w:t xml:space="preserve">- every council’s hazard.total and risk equal the literal Excel formulas.</w:t>
+      </w:r>
+    </w:p>
+    <w:p>
+      <w:pPr>
+        <w:pStyle w:val="Compact"/>
+        <w:numPr>
+          <w:ilvl w:val="0"/>
+          <w:numId w:val="1007"/>
+        </w:numPr>
+      </w:pPr>
+      <w:r>
+        <w:rPr>
+          <w:b/>
+          <w:bCs/>
+        </w:rPr>
+        <w:t xml:space="preserve">Spec-reproduces-INFORM</w:t>
+      </w:r>
+      <w:r>
+        <w:t xml:space="preserve"> </w:t>
+      </w:r>
+      <w:r>
+        <w:t xml:space="preserve">- the all-170 proof, extended to every used indicator before Phase 2 ships.</w:t>
+      </w:r>
+    </w:p>
+    <w:p>
+      <w:pPr>
+        <w:pStyle w:val="Compact"/>
+        <w:numPr>
+          <w:ilvl w:val="0"/>
+          <w:numId w:val="1007"/>
+        </w:numPr>
+      </w:pPr>
+      <w:r>
+        <w:rPr>
+          <w:b/>
+          <w:bCs/>
+        </w:rPr>
+        <w:t xml:space="preserve">Per-indicator validation</w:t>
+      </w:r>
+      <w:r>
+        <w:t xml:space="preserve"> </w:t>
+      </w:r>
+      <w:r>
+        <w:t xml:space="preserve">- type/range/resolution enforced at entry; ERROR flags surfaced.</w:t>
+      </w:r>
+    </w:p>
+    <w:p>
+      <w:pPr>
+        <w:pStyle w:val="Compact"/>
+        <w:numPr>
+          <w:ilvl w:val="0"/>
+          <w:numId w:val="1007"/>
         </w:numPr>
       </w:pPr>
       <w:r>
@@ -3961,6 +4318,9 @@
     <w:abstractNumId w:val="991"/>
   </w:num>
   <w:num w:numId="1006">
+    <w:abstractNumId w:val="991"/>
+  </w:num>
+  <w:num w:numId="1007">
     <w:abstractNumId w:val="99411"/>
     <w:lvlOverride w:ilvl="0">
       <w:startOverride w:val="1"/>

</xml_diff>